<commit_message>
feat: Basic message handling
</commit_message>
<xml_diff>
--- a/Protocol.docx
+++ b/Protocol.docx
@@ -49,11 +49,9 @@
       <w:r>
         <w:t xml:space="preserve"> </w:t>
       </w:r>
-      <w:proofErr w:type="spellStart"/>
-      <w:r>
-        <w:t>initate</w:t>
-      </w:r>
-      <w:proofErr w:type="spellEnd"/>
+      <w:r>
+        <w:t>initiate</w:t>
+      </w:r>
       <w:r>
         <w:t xml:space="preserve"> the session via sending an </w:t>
       </w:r>
@@ -128,6 +126,97 @@
       <w:r>
         <w:t>.</w:t>
       </w:r>
+      <w:r>
+        <w:t xml:space="preserve"> If the server receives an </w:t>
+      </w:r>
+      <w:r>
+        <w:rPr>
+          <w:i/>
+          <w:iCs/>
+        </w:rPr>
+        <w:t>INIT_REQ</w:t>
+      </w:r>
+      <w:r>
+        <w:t xml:space="preserve"> with an invalid (non-zero) version number, it </w:t>
+      </w:r>
+      <w:r>
+        <w:rPr>
+          <w:b/>
+          <w:bCs/>
+        </w:rPr>
+        <w:t>must</w:t>
+      </w:r>
+      <w:r>
+        <w:t xml:space="preserve"> reply with </w:t>
+      </w:r>
+      <w:r>
+        <w:rPr>
+          <w:i/>
+          <w:iCs/>
+        </w:rPr>
+        <w:t>INIT_REQ</w:t>
+      </w:r>
+      <w:r>
+        <w:t xml:space="preserve"> with the accept flag set to false.</w:t>
+      </w:r>
+    </w:p>
+    <w:p>
+      <w:r>
+        <w:t xml:space="preserve">If the server receives any other request before having accepted an </w:t>
+      </w:r>
+      <w:r>
+        <w:rPr>
+          <w:i/>
+          <w:iCs/>
+        </w:rPr>
+        <w:t>INIT_REQ</w:t>
+      </w:r>
+      <w:r>
+        <w:t xml:space="preserve">, it </w:t>
+      </w:r>
+      <w:r>
+        <w:rPr>
+          <w:b/>
+          <w:bCs/>
+        </w:rPr>
+        <w:t>must</w:t>
+      </w:r>
+      <w:r>
+        <w:t xml:space="preserve"> reply to such requests with </w:t>
+      </w:r>
+      <w:r>
+        <w:rPr>
+          <w:i/>
+          <w:iCs/>
+        </w:rPr>
+        <w:t>E_INVALID</w:t>
+      </w:r>
+      <w:r>
+        <w:t>.</w:t>
+      </w:r>
+      <w:r>
+        <w:t xml:space="preserve"> As such, clients </w:t>
+      </w:r>
+      <w:r>
+        <w:rPr>
+          <w:b/>
+          <w:bCs/>
+        </w:rPr>
+        <w:t>must not</w:t>
+      </w:r>
+      <w:r>
+        <w:t xml:space="preserve"> send other requests until having received an accepted </w:t>
+      </w:r>
+      <w:r>
+        <w:rPr>
+          <w:i/>
+          <w:iCs/>
+        </w:rPr>
+        <w:t>INIT_RES</w:t>
+      </w:r>
+      <w:r>
+        <w:t xml:space="preserve"> from the server.</w:t>
+      </w:r>
     </w:p>
     <w:p>
       <w:r>
@@ -141,15 +230,7 @@
         <w:t>should</w:t>
       </w:r>
       <w:r>
-        <w:t xml:space="preserve"> close connections via the normal TCP closing handshake, but may also do so via sending </w:t>
-      </w:r>
-      <w:proofErr w:type="gramStart"/>
-      <w:r>
-        <w:t>a</w:t>
-      </w:r>
-      <w:proofErr w:type="gramEnd"/>
-      <w:r>
-        <w:t xml:space="preserve"> </w:t>
+        <w:t xml:space="preserve"> close connections via the normal TCP closing handshake, but may also do so via sending a </w:t>
       </w:r>
       <w:r>
         <w:rPr>
@@ -177,15 +258,7 @@
     </w:p>
     <w:p>
       <w:r>
-        <w:t xml:space="preserve">File open and release operations are no-ops over the protocol; file reads and writes are always valid by </w:t>
-      </w:r>
-      <w:proofErr w:type="spellStart"/>
-      <w:r>
-        <w:t>inode</w:t>
-      </w:r>
-      <w:proofErr w:type="spellEnd"/>
-      <w:r>
-        <w:t xml:space="preserve"> without needing to be opened first.</w:t>
+        <w:t>File open and release operations are no-ops over the protocol; file reads and writes are always valid by inode without needing to be opened first.</w:t>
       </w:r>
     </w:p>
     <w:p>
@@ -1055,15 +1128,7 @@
         <w:spacing w:line="240" w:lineRule="auto"/>
       </w:pPr>
       <w:r>
-        <w:t xml:space="preserve">Used by the server to complete connection </w:t>
-      </w:r>
-      <w:proofErr w:type="spellStart"/>
-      <w:r>
-        <w:t>initation</w:t>
-      </w:r>
-      <w:proofErr w:type="spellEnd"/>
-      <w:r>
-        <w:t>.</w:t>
+        <w:t>Used by the server to complete connection initation.</w:t>
       </w:r>
     </w:p>
     <w:tbl>
@@ -1400,15 +1465,7 @@
         <w:t>Used by the client to look up a directory entry by filename</w:t>
       </w:r>
       <w:r>
-        <w:t xml:space="preserve"> and get its </w:t>
-      </w:r>
-      <w:proofErr w:type="spellStart"/>
-      <w:r>
-        <w:t>inode</w:t>
-      </w:r>
-      <w:proofErr w:type="spellEnd"/>
-      <w:r>
-        <w:t xml:space="preserve"> number for further requests</w:t>
+        <w:t xml:space="preserve"> and get its inode number for further requests</w:t>
       </w:r>
       <w:r>
         <w:t>.</w:t>
@@ -1622,13 +1679,8 @@
           </w:tcPr>
           <w:p>
             <w:r>
-              <w:t xml:space="preserve">Dir </w:t>
-            </w:r>
-            <w:proofErr w:type="spellStart"/>
-            <w:r>
-              <w:t>Inode</w:t>
-            </w:r>
-            <w:proofErr w:type="spellEnd"/>
+              <w:t>Dir Inode</w:t>
+            </w:r>
           </w:p>
         </w:tc>
         <w:tc>
@@ -1656,13 +1708,8 @@
             <w:tcW w:w="6155" w:type="dxa"/>
           </w:tcPr>
           <w:p>
-            <w:proofErr w:type="spellStart"/>
-            <w:r>
-              <w:t>Inode</w:t>
-            </w:r>
-            <w:proofErr w:type="spellEnd"/>
-            <w:r>
-              <w:t xml:space="preserve"> number of the directory within which we’re looking</w:t>
+            <w:r>
+              <w:t>Inode number of the directory within which we’re looking</w:t>
             </w:r>
           </w:p>
         </w:tc>
@@ -1800,27 +1847,17 @@
         <w:spacing w:line="240" w:lineRule="auto"/>
       </w:pPr>
       <w:r>
-        <w:t xml:space="preserve">Returns the </w:t>
-      </w:r>
-      <w:proofErr w:type="spellStart"/>
+        <w:t>Returns the inode number of the requested</w:t>
+      </w:r>
+      <w:r>
+        <w:t xml:space="preserve"> or created</w:t>
+      </w:r>
+      <w:r>
+        <w:t xml:space="preserve"> </w:t>
+      </w:r>
       <w:r>
         <w:t>inode</w:t>
       </w:r>
-      <w:proofErr w:type="spellEnd"/>
-      <w:r>
-        <w:t xml:space="preserve"> number of the requested</w:t>
-      </w:r>
-      <w:r>
-        <w:t xml:space="preserve"> or created</w:t>
-      </w:r>
-      <w:r>
-        <w:t xml:space="preserve"> </w:t>
-      </w:r>
-      <w:proofErr w:type="spellStart"/>
-      <w:r>
-        <w:t>inode</w:t>
-      </w:r>
-      <w:proofErr w:type="spellEnd"/>
       <w:r>
         <w:t>.</w:t>
       </w:r>
@@ -2062,13 +2099,8 @@
           </w:tcPr>
           <w:p>
             <w:r>
-              <w:t xml:space="preserve">File </w:t>
-            </w:r>
-            <w:proofErr w:type="spellStart"/>
-            <w:r>
-              <w:t>Inode</w:t>
-            </w:r>
-            <w:proofErr w:type="spellEnd"/>
+              <w:t>File Inode</w:t>
+            </w:r>
           </w:p>
         </w:tc>
         <w:tc>
@@ -2097,15 +2129,7 @@
           </w:tcPr>
           <w:p>
             <w:r>
-              <w:t xml:space="preserve">The </w:t>
-            </w:r>
-            <w:proofErr w:type="spellStart"/>
-            <w:r>
-              <w:t>inode</w:t>
-            </w:r>
-            <w:proofErr w:type="spellEnd"/>
-            <w:r>
-              <w:t xml:space="preserve"> number of the file.</w:t>
+              <w:t>The inode number of the file.</w:t>
             </w:r>
           </w:p>
         </w:tc>
@@ -2347,13 +2371,8 @@
               <w:t>File</w:t>
             </w:r>
             <w:r>
-              <w:t xml:space="preserve"> </w:t>
-            </w:r>
-            <w:proofErr w:type="spellStart"/>
-            <w:r>
-              <w:t>Inode</w:t>
-            </w:r>
-            <w:proofErr w:type="spellEnd"/>
+              <w:t xml:space="preserve"> Inode</w:t>
+            </w:r>
           </w:p>
         </w:tc>
         <w:tc>
@@ -2381,13 +2400,8 @@
             <w:tcW w:w="6155" w:type="dxa"/>
           </w:tcPr>
           <w:p>
-            <w:proofErr w:type="spellStart"/>
-            <w:r>
-              <w:t>Inode</w:t>
-            </w:r>
-            <w:proofErr w:type="spellEnd"/>
-            <w:r>
-              <w:t xml:space="preserve"> number of the </w:t>
+            <w:r>
+              <w:t xml:space="preserve">Inode number of the </w:t>
             </w:r>
             <w:r>
               <w:t>file</w:t>
@@ -3271,11 +3285,9 @@
             <w:tcW w:w="1589" w:type="dxa"/>
           </w:tcPr>
           <w:p>
-            <w:proofErr w:type="spellStart"/>
             <w:r>
               <w:t>rdev</w:t>
             </w:r>
-            <w:proofErr w:type="spellEnd"/>
           </w:p>
         </w:tc>
         <w:tc>
@@ -3358,21 +3370,12 @@
             <w:r>
               <w:t xml:space="preserve">Block size to be reported by </w:t>
             </w:r>
-            <w:proofErr w:type="gramStart"/>
             <w:r>
               <w:rPr>
                 <w:i/>
                 <w:iCs/>
               </w:rPr>
-              <w:t>stat(</w:t>
-            </w:r>
-            <w:proofErr w:type="gramEnd"/>
-            <w:r>
-              <w:rPr>
-                <w:i/>
-                <w:iCs/>
-              </w:rPr>
-              <w:t>)</w:t>
+              <w:t>stat()</w:t>
             </w:r>
           </w:p>
         </w:tc>
@@ -3660,13 +3663,8 @@
           </w:tcPr>
           <w:p>
             <w:r>
-              <w:t xml:space="preserve">File </w:t>
-            </w:r>
-            <w:proofErr w:type="spellStart"/>
-            <w:r>
-              <w:t>Inode</w:t>
-            </w:r>
-            <w:proofErr w:type="spellEnd"/>
+              <w:t>File Inode</w:t>
+            </w:r>
           </w:p>
         </w:tc>
         <w:tc>
@@ -3694,13 +3692,8 @@
             <w:tcW w:w="6155" w:type="dxa"/>
           </w:tcPr>
           <w:p>
-            <w:proofErr w:type="spellStart"/>
-            <w:r>
-              <w:t>Inode</w:t>
-            </w:r>
-            <w:proofErr w:type="spellEnd"/>
-            <w:r>
-              <w:t xml:space="preserve"> number of the file whose attributes we want to edit</w:t>
+            <w:r>
+              <w:t>Inode number of the file whose attributes we want to edit</w:t>
             </w:r>
           </w:p>
         </w:tc>
@@ -3768,18 +3761,10 @@
           <w:p/>
           <w:p>
             <w:r>
-              <w:t xml:space="preserve">Fields whose bit is set high </w:t>
-            </w:r>
-            <w:proofErr w:type="gramStart"/>
-            <w:r>
-              <w:t xml:space="preserve">will be </w:t>
-            </w:r>
-            <w:r>
-              <w:t>are</w:t>
-            </w:r>
-            <w:proofErr w:type="gramEnd"/>
-            <w:r>
-              <w:t xml:space="preserve"> present in the message. Fields whose bit is set low </w:t>
+              <w:t xml:space="preserve">Fields whose bit is set high will be </w:t>
+            </w:r>
+            <w:r>
+              <w:t xml:space="preserve">are present in the message. Fields whose bit is set low </w:t>
             </w:r>
             <w:r>
               <w:rPr>
@@ -4222,15 +4207,7 @@
         <w:t>, attribute updates,</w:t>
       </w:r>
       <w:r>
-        <w:t xml:space="preserve"> or </w:t>
-      </w:r>
-      <w:proofErr w:type="spellStart"/>
-      <w:r>
-        <w:t>inode</w:t>
-      </w:r>
-      <w:proofErr w:type="spellEnd"/>
-      <w:r>
-        <w:t xml:space="preserve"> removal.</w:t>
+        <w:t xml:space="preserve"> or inode removal.</w:t>
       </w:r>
     </w:p>
     <w:tbl>
@@ -4692,30 +4669,12 @@
       <w:r>
         <w:t xml:space="preserve"> from </w:t>
       </w:r>
-      <w:proofErr w:type="spellStart"/>
-      <w:proofErr w:type="gramStart"/>
       <w:r>
         <w:rPr>
           <w:i/>
           <w:iCs/>
         </w:rPr>
-        <w:t>statfs</w:t>
-      </w:r>
-      <w:proofErr w:type="spellEnd"/>
-      <w:r>
-        <w:rPr>
-          <w:i/>
-          <w:iCs/>
-        </w:rPr>
-        <w:t>(</w:t>
-      </w:r>
-      <w:proofErr w:type="gramEnd"/>
-      <w:r>
-        <w:rPr>
-          <w:i/>
-          <w:iCs/>
-        </w:rPr>
-        <w:t>2)</w:t>
+        <w:t>statfs(2)</w:t>
       </w:r>
       <w:r>
         <w:t>. Reflects the actual disk usage of the server.</w:t>
@@ -5107,13 +5066,8 @@
           </w:tcPr>
           <w:p>
             <w:r>
-              <w:t xml:space="preserve">Total </w:t>
-            </w:r>
-            <w:proofErr w:type="spellStart"/>
-            <w:r>
-              <w:t>Inodes</w:t>
-            </w:r>
-            <w:proofErr w:type="spellEnd"/>
+              <w:t>Total Inodes</w:t>
+            </w:r>
           </w:p>
         </w:tc>
         <w:tc>
@@ -5142,13 +5096,8 @@
           </w:tcPr>
           <w:p>
             <w:r>
-              <w:t xml:space="preserve">Total number of </w:t>
-            </w:r>
-            <w:proofErr w:type="spellStart"/>
-            <w:r>
-              <w:t>inodes</w:t>
-            </w:r>
-            <w:proofErr w:type="spellEnd"/>
+              <w:t>Total number of inodes</w:t>
+            </w:r>
           </w:p>
         </w:tc>
       </w:tr>
@@ -5189,13 +5138,8 @@
           </w:tcPr>
           <w:p>
             <w:r>
-              <w:t xml:space="preserve">Number of free </w:t>
-            </w:r>
-            <w:proofErr w:type="spellStart"/>
-            <w:r>
-              <w:t>inodes</w:t>
-            </w:r>
-            <w:proofErr w:type="spellEnd"/>
+              <w:t>Number of free inodes</w:t>
+            </w:r>
           </w:p>
         </w:tc>
       </w:tr>
@@ -5534,13 +5478,8 @@
           </w:tcPr>
           <w:p>
             <w:r>
-              <w:t xml:space="preserve">Dir </w:t>
-            </w:r>
-            <w:proofErr w:type="spellStart"/>
-            <w:r>
-              <w:t>Inode</w:t>
-            </w:r>
-            <w:proofErr w:type="spellEnd"/>
+              <w:t>Dir Inode</w:t>
+            </w:r>
           </w:p>
         </w:tc>
         <w:tc>
@@ -5568,13 +5507,8 @@
             <w:tcW w:w="6155" w:type="dxa"/>
           </w:tcPr>
           <w:p>
-            <w:proofErr w:type="spellStart"/>
-            <w:r>
-              <w:t>Inode</w:t>
-            </w:r>
-            <w:proofErr w:type="spellEnd"/>
-            <w:r>
-              <w:t xml:space="preserve"> of the directory within which to create the file</w:t>
+            <w:r>
+              <w:t>Inode of the directory within which to create the file</w:t>
             </w:r>
           </w:p>
         </w:tc>
@@ -5666,70 +5600,61 @@
             <w:r>
               <w:t xml:space="preserve"> as passed by </w:t>
             </w:r>
-            <w:proofErr w:type="gramStart"/>
             <w:r>
               <w:rPr>
                 <w:i/>
                 <w:iCs/>
               </w:rPr>
-              <w:t>open(</w:t>
-            </w:r>
-            <w:proofErr w:type="gramEnd"/>
+              <w:t>open(2)</w:t>
+            </w:r>
+            <w:r>
+              <w:t xml:space="preserve"> </w:t>
+            </w:r>
+            <w:r>
+              <w:t xml:space="preserve">(e.g. </w:t>
+            </w:r>
             <w:r>
               <w:rPr>
                 <w:i/>
                 <w:iCs/>
               </w:rPr>
-              <w:t>2)</w:t>
-            </w:r>
-            <w:r>
-              <w:t xml:space="preserve"> </w:t>
-            </w:r>
-            <w:r>
-              <w:t xml:space="preserve">(e.g. </w:t>
+              <w:t>O_RDWR</w:t>
+            </w:r>
+            <w:r>
+              <w:t xml:space="preserve">, </w:t>
             </w:r>
             <w:r>
               <w:rPr>
                 <w:i/>
                 <w:iCs/>
               </w:rPr>
-              <w:t>O_RDWR</w:t>
-            </w:r>
-            <w:r>
-              <w:t xml:space="preserve">, </w:t>
+              <w:t>O</w:t>
             </w:r>
             <w:r>
               <w:rPr>
                 <w:i/>
                 <w:iCs/>
               </w:rPr>
-              <w:t>O</w:t>
+              <w:t>_</w:t>
             </w:r>
             <w:r>
               <w:rPr>
                 <w:i/>
                 <w:iCs/>
               </w:rPr>
-              <w:t>_</w:t>
+              <w:t>TRUNC</w:t>
+            </w:r>
+            <w:r>
+              <w:t>)</w:t>
+            </w:r>
+            <w:r>
+              <w:t xml:space="preserve">. Ignored if </w:t>
             </w:r>
             <w:r>
               <w:rPr>
                 <w:i/>
                 <w:iCs/>
               </w:rPr>
-              <w:t>TRUNC</w:t>
-            </w:r>
-            <w:r>
-              <w:t>)</w:t>
-            </w:r>
-            <w:r>
-              <w:t xml:space="preserve">. Ignored if </w:t>
-            </w:r>
-            <w:r>
-              <w:rPr>
-                <w:i/>
-                <w:iCs/>
-              </w:rPr>
               <w:t>Directory</w:t>
             </w:r>
             <w:r>
@@ -5788,15 +5713,7 @@
               <w:t>if</w:t>
             </w:r>
             <w:r>
-              <w:t xml:space="preserve"> the </w:t>
-            </w:r>
-            <w:proofErr w:type="spellStart"/>
-            <w:r>
-              <w:t>inode</w:t>
-            </w:r>
-            <w:proofErr w:type="spellEnd"/>
-            <w:r>
-              <w:t xml:space="preserve"> to be created is a directory, </w:t>
+              <w:t xml:space="preserve"> the inode to be created is a directory, </w:t>
             </w:r>
             <w:r>
               <w:rPr>
@@ -6000,13 +5917,8 @@
         <w:t>A request from</w:t>
       </w:r>
       <w:r>
-        <w:t xml:space="preserve"> the client to read data from the given </w:t>
-      </w:r>
-      <w:proofErr w:type="spellStart"/>
-      <w:r>
-        <w:t>inode</w:t>
-      </w:r>
-      <w:proofErr w:type="spellEnd"/>
+        <w:t xml:space="preserve"> the client to read data from the given inode</w:t>
+      </w:r>
     </w:p>
     <w:tbl>
       <w:tblPr>
@@ -6215,11 +6127,9 @@
             <w:tcW w:w="1589" w:type="dxa"/>
           </w:tcPr>
           <w:p>
-            <w:proofErr w:type="spellStart"/>
             <w:r>
               <w:t>Inode</w:t>
             </w:r>
-            <w:proofErr w:type="spellEnd"/>
           </w:p>
         </w:tc>
         <w:tc>
@@ -6247,13 +6157,8 @@
             <w:tcW w:w="6155" w:type="dxa"/>
           </w:tcPr>
           <w:p>
-            <w:proofErr w:type="spellStart"/>
-            <w:r>
-              <w:t>Inode</w:t>
-            </w:r>
-            <w:proofErr w:type="spellEnd"/>
-            <w:r>
-              <w:t xml:space="preserve"> of the file from which to read</w:t>
+            <w:r>
+              <w:t>Inode of the file from which to read</w:t>
             </w:r>
           </w:p>
         </w:tc>
@@ -7149,13 +7054,8 @@
             <w:tcW w:w="1589" w:type="dxa"/>
           </w:tcPr>
           <w:p>
-            <w:proofErr w:type="spellStart"/>
-            <w:r>
-              <w:t>Inode</w:t>
-            </w:r>
-            <w:proofErr w:type="spellEnd"/>
-            <w:r>
-              <w:t xml:space="preserve"> Number</w:t>
+            <w:r>
+              <w:t>Inode Number</w:t>
             </w:r>
           </w:p>
         </w:tc>
@@ -7185,15 +7085,7 @@
           </w:tcPr>
           <w:p>
             <w:r>
-              <w:t xml:space="preserve">The </w:t>
-            </w:r>
-            <w:proofErr w:type="spellStart"/>
-            <w:r>
-              <w:t>inode</w:t>
-            </w:r>
-            <w:proofErr w:type="spellEnd"/>
-            <w:r>
-              <w:t xml:space="preserve"> number of the directory entry.</w:t>
+              <w:t>The inode number of the directory entry.</w:t>
             </w:r>
           </w:p>
         </w:tc>
@@ -7425,15 +7317,7 @@
         <w:spacing w:line="240" w:lineRule="auto"/>
       </w:pPr>
       <w:r>
-        <w:t xml:space="preserve">A request from the client to write data to the given </w:t>
-      </w:r>
-      <w:proofErr w:type="spellStart"/>
-      <w:r>
-        <w:t>inode</w:t>
-      </w:r>
-      <w:proofErr w:type="spellEnd"/>
-      <w:r>
-        <w:t xml:space="preserve">. </w:t>
+        <w:t xml:space="preserve">A request from the client to write data to the given inode. </w:t>
       </w:r>
       <w:r>
         <w:t xml:space="preserve">The server </w:t>
@@ -7710,11 +7594,9 @@
             <w:tcW w:w="1589" w:type="dxa"/>
           </w:tcPr>
           <w:p>
-            <w:proofErr w:type="spellStart"/>
             <w:r>
               <w:t>Inode</w:t>
             </w:r>
-            <w:proofErr w:type="spellEnd"/>
           </w:p>
         </w:tc>
         <w:tc>
@@ -7742,13 +7624,8 @@
             <w:tcW w:w="6155" w:type="dxa"/>
           </w:tcPr>
           <w:p>
-            <w:proofErr w:type="spellStart"/>
-            <w:r>
-              <w:t>Inode</w:t>
-            </w:r>
-            <w:proofErr w:type="spellEnd"/>
-            <w:r>
-              <w:t xml:space="preserve"> of the file to write to</w:t>
+            <w:r>
+              <w:t>Inode of the file to write to</w:t>
             </w:r>
           </w:p>
         </w:tc>
@@ -8147,11 +8024,9 @@
             <w:tcW w:w="1589" w:type="dxa"/>
           </w:tcPr>
           <w:p>
-            <w:proofErr w:type="spellStart"/>
             <w:r>
               <w:t>Inode</w:t>
             </w:r>
-            <w:proofErr w:type="spellEnd"/>
           </w:p>
         </w:tc>
         <w:tc>
@@ -8180,15 +8055,7 @@
           </w:tcPr>
           <w:p>
             <w:r>
-              <w:t xml:space="preserve">The </w:t>
-            </w:r>
-            <w:proofErr w:type="spellStart"/>
-            <w:r>
-              <w:t>inode</w:t>
-            </w:r>
-            <w:proofErr w:type="spellEnd"/>
-            <w:r>
-              <w:t xml:space="preserve"> number of the </w:t>
+              <w:t xml:space="preserve">The inode number of the </w:t>
             </w:r>
             <w:r>
               <w:t>directory</w:t>
@@ -8210,70 +8077,27 @@
     </w:p>
     <w:p>
       <w:r>
-        <w:t xml:space="preserve">Used by the client to remove an </w:t>
-      </w:r>
-      <w:proofErr w:type="spellStart"/>
-      <w:r>
-        <w:t>inode</w:t>
-      </w:r>
-      <w:proofErr w:type="spellEnd"/>
-      <w:r>
-        <w:t xml:space="preserve">, corresponding to the </w:t>
-      </w:r>
-      <w:proofErr w:type="gramStart"/>
+        <w:t xml:space="preserve">Used by the client to remove an inode, corresponding to the </w:t>
+      </w:r>
       <w:r>
         <w:rPr>
           <w:i/>
           <w:iCs/>
         </w:rPr>
-        <w:t>unlink(</w:t>
-      </w:r>
-      <w:proofErr w:type="gramEnd"/>
+        <w:t xml:space="preserve">unlink(2) </w:t>
+      </w:r>
+      <w:r>
+        <w:t xml:space="preserve">and </w:t>
+      </w:r>
       <w:r>
         <w:rPr>
           <w:i/>
           <w:iCs/>
         </w:rPr>
-        <w:t xml:space="preserve">2) </w:t>
-      </w:r>
-      <w:r>
-        <w:t xml:space="preserve">and </w:t>
-      </w:r>
-      <w:proofErr w:type="spellStart"/>
-      <w:proofErr w:type="gramStart"/>
-      <w:r>
-        <w:rPr>
-          <w:i/>
-          <w:iCs/>
-        </w:rPr>
-        <w:t>rmdir</w:t>
-      </w:r>
-      <w:proofErr w:type="spellEnd"/>
-      <w:r>
-        <w:rPr>
-          <w:i/>
-          <w:iCs/>
-        </w:rPr>
-        <w:t>(</w:t>
-      </w:r>
-      <w:proofErr w:type="gramEnd"/>
-      <w:r>
-        <w:rPr>
-          <w:i/>
-          <w:iCs/>
-        </w:rPr>
-        <w:t>2)</w:t>
-      </w:r>
-      <w:r>
-        <w:t xml:space="preserve"> </w:t>
-      </w:r>
-      <w:proofErr w:type="spellStart"/>
-      <w:r>
-        <w:t>syscalls</w:t>
-      </w:r>
-      <w:proofErr w:type="spellEnd"/>
-      <w:r>
-        <w:t xml:space="preserve">. If invoked on a file, the server </w:t>
+        <w:t>rmdir(2)</w:t>
+      </w:r>
+      <w:r>
+        <w:t xml:space="preserve"> syscalls. If invoked on a file, the server </w:t>
       </w:r>
       <w:r>
         <w:rPr>
@@ -8547,11 +8371,9 @@
             <w:tcW w:w="1589" w:type="dxa"/>
           </w:tcPr>
           <w:p>
-            <w:proofErr w:type="spellStart"/>
             <w:r>
               <w:t>Inode</w:t>
             </w:r>
-            <w:proofErr w:type="spellEnd"/>
           </w:p>
         </w:tc>
         <w:tc>
@@ -8580,23 +8402,10 @@
           </w:tcPr>
           <w:p>
             <w:r>
-              <w:t xml:space="preserve">The </w:t>
-            </w:r>
-            <w:proofErr w:type="spellStart"/>
-            <w:r>
-              <w:t>inode</w:t>
-            </w:r>
-            <w:proofErr w:type="spellEnd"/>
-            <w:r>
-              <w:t xml:space="preserve"> number of the </w:t>
-            </w:r>
-            <w:proofErr w:type="spellStart"/>
-            <w:r>
-              <w:t>inode</w:t>
-            </w:r>
-            <w:proofErr w:type="spellEnd"/>
-            <w:r>
-              <w:t xml:space="preserve"> to remove</w:t>
+              <w:t xml:space="preserve">The inode number of the </w:t>
+            </w:r>
+            <w:r>
+              <w:t>inode to remove</w:t>
             </w:r>
             <w:r>
               <w:t>.</w:t>
@@ -8618,15 +8427,7 @@
     </w:p>
     <w:p>
       <w:r>
-        <w:t xml:space="preserve">Used by the client to move or rename an </w:t>
-      </w:r>
-      <w:proofErr w:type="spellStart"/>
-      <w:r>
-        <w:t>inode</w:t>
-      </w:r>
-      <w:proofErr w:type="spellEnd"/>
-      <w:r>
-        <w:t xml:space="preserve">. The server </w:t>
+        <w:t xml:space="preserve">Used by the client to move or rename an inode. The server </w:t>
       </w:r>
       <w:r>
         <w:rPr>
@@ -8928,11 +8729,9 @@
             <w:tcW w:w="1589" w:type="dxa"/>
           </w:tcPr>
           <w:p>
-            <w:proofErr w:type="spellStart"/>
             <w:r>
               <w:t>Inode</w:t>
             </w:r>
-            <w:proofErr w:type="spellEnd"/>
           </w:p>
         </w:tc>
         <w:tc>
@@ -8961,23 +8760,7 @@
           </w:tcPr>
           <w:p>
             <w:r>
-              <w:t xml:space="preserve">The </w:t>
-            </w:r>
-            <w:proofErr w:type="spellStart"/>
-            <w:r>
-              <w:t>inode</w:t>
-            </w:r>
-            <w:proofErr w:type="spellEnd"/>
-            <w:r>
-              <w:t xml:space="preserve"> number of the </w:t>
-            </w:r>
-            <w:proofErr w:type="spellStart"/>
-            <w:r>
-              <w:t>inode</w:t>
-            </w:r>
-            <w:proofErr w:type="spellEnd"/>
-            <w:r>
-              <w:t xml:space="preserve"> to move.</w:t>
+              <w:t>The inode number of the inode to move.</w:t>
             </w:r>
           </w:p>
         </w:tc>
@@ -9019,23 +8802,7 @@
           </w:tcPr>
           <w:p>
             <w:r>
-              <w:t xml:space="preserve">The </w:t>
-            </w:r>
-            <w:proofErr w:type="spellStart"/>
-            <w:r>
-              <w:t>inode</w:t>
-            </w:r>
-            <w:proofErr w:type="spellEnd"/>
-            <w:r>
-              <w:t xml:space="preserve"> number of the directory to which the </w:t>
-            </w:r>
-            <w:proofErr w:type="spellStart"/>
-            <w:r>
-              <w:t>inode</w:t>
-            </w:r>
-            <w:proofErr w:type="spellEnd"/>
-            <w:r>
-              <w:t xml:space="preserve"> should be moved.</w:t>
+              <w:t>The inode number of the directory to which the inode should be moved.</w:t>
             </w:r>
           </w:p>
         </w:tc>
@@ -9122,15 +8889,7 @@
               <w:t>The filename</w:t>
             </w:r>
             <w:r>
-              <w:t xml:space="preserve"> within the destination directory to which the </w:t>
-            </w:r>
-            <w:proofErr w:type="spellStart"/>
-            <w:r>
-              <w:t>inode</w:t>
-            </w:r>
-            <w:proofErr w:type="spellEnd"/>
-            <w:r>
-              <w:t xml:space="preserve"> should be moved</w:t>
+              <w:t xml:space="preserve"> within the destination directory to which the inode should be moved</w:t>
             </w:r>
             <w:r>
               <w:t xml:space="preserve">. </w:t>
@@ -9353,13 +9112,8 @@
             <w:r>
               <w:t xml:space="preserve"> requested </w:t>
             </w:r>
-            <w:proofErr w:type="spellStart"/>
-            <w:r>
-              <w:t>inode</w:t>
-            </w:r>
-            <w:proofErr w:type="spellEnd"/>
-            <w:r>
-              <w:t xml:space="preserve"> </w:t>
+            <w:r>
+              <w:t xml:space="preserve">inode </w:t>
             </w:r>
             <w:r>
               <w:t>doesn’t exist</w:t>
@@ -9404,15 +9158,7 @@
               <w:t xml:space="preserve">. </w:t>
             </w:r>
             <w:r>
-              <w:t xml:space="preserve">An </w:t>
-            </w:r>
-            <w:proofErr w:type="spellStart"/>
-            <w:r>
-              <w:t>inode</w:t>
-            </w:r>
-            <w:proofErr w:type="spellEnd"/>
-            <w:r>
-              <w:t xml:space="preserve"> already exists at the requested destination path of a creation or renaming</w:t>
+              <w:t>An inode already exists at the requested destination path of a creation or renaming</w:t>
             </w:r>
             <w:r>
               <w:t xml:space="preserve"> operation</w:t>
@@ -9499,15 +9245,7 @@
         <w:footnoteRef/>
       </w:r>
       <w:r>
-        <w:t xml:space="preserve"> The number of seconds since 1 </w:t>
-      </w:r>
-      <w:proofErr w:type="gramStart"/>
-      <w:r>
-        <w:t>January,</w:t>
-      </w:r>
-      <w:proofErr w:type="gramEnd"/>
-      <w:r>
-        <w:t xml:space="preserve"> 1970 (the Unix epoch).</w:t>
+        <w:t xml:space="preserve"> The number of seconds since 1 January, 1970 (the Unix epoch).</w:t>
       </w:r>
     </w:p>
   </w:footnote>

</xml_diff>

<commit_message>
feat: use 32-bit write lengths
</commit_message>
<xml_diff>
--- a/Protocol.docx
+++ b/Protocol.docx
@@ -230,7 +230,15 @@
         <w:t>should</w:t>
       </w:r>
       <w:r>
-        <w:t xml:space="preserve"> close connections via the normal TCP closing handshake, but may also do so via sending a </w:t>
+        <w:t xml:space="preserve"> close connections via the normal TCP closing handshake, but may also do so via sending </w:t>
+      </w:r>
+      <w:proofErr w:type="gramStart"/>
+      <w:r>
+        <w:t>a</w:t>
+      </w:r>
+      <w:proofErr w:type="gramEnd"/>
+      <w:r>
+        <w:t xml:space="preserve"> </w:t>
       </w:r>
       <w:r>
         <w:rPr>
@@ -258,7 +266,15 @@
     </w:p>
     <w:p>
       <w:r>
-        <w:t>File open and release operations are no-ops over the protocol; file reads and writes are always valid by inode without needing to be opened first.</w:t>
+        <w:t xml:space="preserve">File open and release operations are no-ops over the protocol; file reads and writes are always valid by </w:t>
+      </w:r>
+      <w:proofErr w:type="spellStart"/>
+      <w:r>
+        <w:t>inode</w:t>
+      </w:r>
+      <w:proofErr w:type="spellEnd"/>
+      <w:r>
+        <w:t xml:space="preserve"> without needing to be opened first.</w:t>
       </w:r>
     </w:p>
     <w:p>
@@ -1128,7 +1144,15 @@
         <w:spacing w:line="240" w:lineRule="auto"/>
       </w:pPr>
       <w:r>
-        <w:t>Used by the server to complete connection initation.</w:t>
+        <w:t xml:space="preserve">Used by the server to complete connection </w:t>
+      </w:r>
+      <w:proofErr w:type="spellStart"/>
+      <w:r>
+        <w:t>initation</w:t>
+      </w:r>
+      <w:proofErr w:type="spellEnd"/>
+      <w:r>
+        <w:t>.</w:t>
       </w:r>
     </w:p>
     <w:tbl>
@@ -1465,7 +1489,15 @@
         <w:t>Used by the client to look up a directory entry by filename</w:t>
       </w:r>
       <w:r>
-        <w:t xml:space="preserve"> and get its inode number for further requests</w:t>
+        <w:t xml:space="preserve"> and get its </w:t>
+      </w:r>
+      <w:proofErr w:type="spellStart"/>
+      <w:r>
+        <w:t>inode</w:t>
+      </w:r>
+      <w:proofErr w:type="spellEnd"/>
+      <w:r>
+        <w:t xml:space="preserve"> number for further requests</w:t>
       </w:r>
       <w:r>
         <w:t>.</w:t>
@@ -1679,8 +1711,13 @@
           </w:tcPr>
           <w:p>
             <w:r>
-              <w:t>Dir Inode</w:t>
-            </w:r>
+              <w:t xml:space="preserve">Dir </w:t>
+            </w:r>
+            <w:proofErr w:type="spellStart"/>
+            <w:r>
+              <w:t>Inode</w:t>
+            </w:r>
+            <w:proofErr w:type="spellEnd"/>
           </w:p>
         </w:tc>
         <w:tc>
@@ -1708,8 +1745,13 @@
             <w:tcW w:w="6155" w:type="dxa"/>
           </w:tcPr>
           <w:p>
-            <w:r>
-              <w:t>Inode number of the directory within which we’re looking</w:t>
+            <w:proofErr w:type="spellStart"/>
+            <w:r>
+              <w:t>Inode</w:t>
+            </w:r>
+            <w:proofErr w:type="spellEnd"/>
+            <w:r>
+              <w:t xml:space="preserve"> number of the directory within which we’re looking</w:t>
             </w:r>
           </w:p>
         </w:tc>
@@ -1847,7 +1889,15 @@
         <w:spacing w:line="240" w:lineRule="auto"/>
       </w:pPr>
       <w:r>
-        <w:t>Returns the inode number of the requested</w:t>
+        <w:t xml:space="preserve">Returns the </w:t>
+      </w:r>
+      <w:proofErr w:type="spellStart"/>
+      <w:r>
+        <w:t>inode</w:t>
+      </w:r>
+      <w:proofErr w:type="spellEnd"/>
+      <w:r>
+        <w:t xml:space="preserve"> number of the requested</w:t>
       </w:r>
       <w:r>
         <w:t xml:space="preserve"> or created</w:t>
@@ -1855,9 +1905,11 @@
       <w:r>
         <w:t xml:space="preserve"> </w:t>
       </w:r>
+      <w:proofErr w:type="spellStart"/>
       <w:r>
         <w:t>inode</w:t>
       </w:r>
+      <w:proofErr w:type="spellEnd"/>
       <w:r>
         <w:t>.</w:t>
       </w:r>
@@ -2099,8 +2151,13 @@
           </w:tcPr>
           <w:p>
             <w:r>
-              <w:t>File Inode</w:t>
-            </w:r>
+              <w:t xml:space="preserve">File </w:t>
+            </w:r>
+            <w:proofErr w:type="spellStart"/>
+            <w:r>
+              <w:t>Inode</w:t>
+            </w:r>
+            <w:proofErr w:type="spellEnd"/>
           </w:p>
         </w:tc>
         <w:tc>
@@ -2129,7 +2186,15 @@
           </w:tcPr>
           <w:p>
             <w:r>
-              <w:t>The inode number of the file.</w:t>
+              <w:t xml:space="preserve">The </w:t>
+            </w:r>
+            <w:proofErr w:type="spellStart"/>
+            <w:r>
+              <w:t>inode</w:t>
+            </w:r>
+            <w:proofErr w:type="spellEnd"/>
+            <w:r>
+              <w:t xml:space="preserve"> number of the file.</w:t>
             </w:r>
           </w:p>
         </w:tc>
@@ -2371,8 +2436,13 @@
               <w:t>File</w:t>
             </w:r>
             <w:r>
-              <w:t xml:space="preserve"> Inode</w:t>
-            </w:r>
+              <w:t xml:space="preserve"> </w:t>
+            </w:r>
+            <w:proofErr w:type="spellStart"/>
+            <w:r>
+              <w:t>Inode</w:t>
+            </w:r>
+            <w:proofErr w:type="spellEnd"/>
           </w:p>
         </w:tc>
         <w:tc>
@@ -2400,8 +2470,13 @@
             <w:tcW w:w="6155" w:type="dxa"/>
           </w:tcPr>
           <w:p>
-            <w:r>
-              <w:t xml:space="preserve">Inode number of the </w:t>
+            <w:proofErr w:type="spellStart"/>
+            <w:r>
+              <w:t>Inode</w:t>
+            </w:r>
+            <w:proofErr w:type="spellEnd"/>
+            <w:r>
+              <w:t xml:space="preserve"> number of the </w:t>
             </w:r>
             <w:r>
               <w:t>file</w:t>
@@ -3285,9 +3360,11 @@
             <w:tcW w:w="1589" w:type="dxa"/>
           </w:tcPr>
           <w:p>
+            <w:proofErr w:type="spellStart"/>
             <w:r>
               <w:t>rdev</w:t>
             </w:r>
+            <w:proofErr w:type="spellEnd"/>
           </w:p>
         </w:tc>
         <w:tc>
@@ -3370,12 +3447,21 @@
             <w:r>
               <w:t xml:space="preserve">Block size to be reported by </w:t>
             </w:r>
+            <w:proofErr w:type="gramStart"/>
             <w:r>
               <w:rPr>
                 <w:i/>
                 <w:iCs/>
               </w:rPr>
-              <w:t>stat()</w:t>
+              <w:t>stat(</w:t>
+            </w:r>
+            <w:proofErr w:type="gramEnd"/>
+            <w:r>
+              <w:rPr>
+                <w:i/>
+                <w:iCs/>
+              </w:rPr>
+              <w:t>)</w:t>
             </w:r>
           </w:p>
         </w:tc>
@@ -3663,8 +3749,13 @@
           </w:tcPr>
           <w:p>
             <w:r>
-              <w:t>File Inode</w:t>
-            </w:r>
+              <w:t xml:space="preserve">File </w:t>
+            </w:r>
+            <w:proofErr w:type="spellStart"/>
+            <w:r>
+              <w:t>Inode</w:t>
+            </w:r>
+            <w:proofErr w:type="spellEnd"/>
           </w:p>
         </w:tc>
         <w:tc>
@@ -3692,8 +3783,13 @@
             <w:tcW w:w="6155" w:type="dxa"/>
           </w:tcPr>
           <w:p>
-            <w:r>
-              <w:t>Inode number of the file whose attributes we want to edit</w:t>
+            <w:proofErr w:type="spellStart"/>
+            <w:r>
+              <w:t>Inode</w:t>
+            </w:r>
+            <w:proofErr w:type="spellEnd"/>
+            <w:r>
+              <w:t xml:space="preserve"> number of the file whose attributes we want to edit</w:t>
             </w:r>
           </w:p>
         </w:tc>
@@ -3761,10 +3857,18 @@
           <w:p/>
           <w:p>
             <w:r>
-              <w:t xml:space="preserve">Fields whose bit is set high will be </w:t>
-            </w:r>
-            <w:r>
-              <w:t xml:space="preserve">are present in the message. Fields whose bit is set low </w:t>
+              <w:t xml:space="preserve">Fields whose bit is set high </w:t>
+            </w:r>
+            <w:proofErr w:type="gramStart"/>
+            <w:r>
+              <w:t xml:space="preserve">will be </w:t>
+            </w:r>
+            <w:r>
+              <w:t>are</w:t>
+            </w:r>
+            <w:proofErr w:type="gramEnd"/>
+            <w:r>
+              <w:t xml:space="preserve"> present in the message. Fields whose bit is set low </w:t>
             </w:r>
             <w:r>
               <w:rPr>
@@ -4207,7 +4311,15 @@
         <w:t>, attribute updates,</w:t>
       </w:r>
       <w:r>
-        <w:t xml:space="preserve"> or inode removal.</w:t>
+        <w:t xml:space="preserve"> or </w:t>
+      </w:r>
+      <w:proofErr w:type="spellStart"/>
+      <w:r>
+        <w:t>inode</w:t>
+      </w:r>
+      <w:proofErr w:type="spellEnd"/>
+      <w:r>
+        <w:t xml:space="preserve"> removal.</w:t>
       </w:r>
     </w:p>
     <w:tbl>
@@ -4669,12 +4781,30 @@
       <w:r>
         <w:t xml:space="preserve"> from </w:t>
       </w:r>
+      <w:proofErr w:type="spellStart"/>
+      <w:proofErr w:type="gramStart"/>
       <w:r>
         <w:rPr>
           <w:i/>
           <w:iCs/>
         </w:rPr>
-        <w:t>statfs(2)</w:t>
+        <w:t>statfs</w:t>
+      </w:r>
+      <w:proofErr w:type="spellEnd"/>
+      <w:r>
+        <w:rPr>
+          <w:i/>
+          <w:iCs/>
+        </w:rPr>
+        <w:t>(</w:t>
+      </w:r>
+      <w:proofErr w:type="gramEnd"/>
+      <w:r>
+        <w:rPr>
+          <w:i/>
+          <w:iCs/>
+        </w:rPr>
+        <w:t>2)</w:t>
       </w:r>
       <w:r>
         <w:t>. Reflects the actual disk usage of the server.</w:t>
@@ -5066,8 +5196,13 @@
           </w:tcPr>
           <w:p>
             <w:r>
-              <w:t>Total Inodes</w:t>
-            </w:r>
+              <w:t xml:space="preserve">Total </w:t>
+            </w:r>
+            <w:proofErr w:type="spellStart"/>
+            <w:r>
+              <w:t>Inodes</w:t>
+            </w:r>
+            <w:proofErr w:type="spellEnd"/>
           </w:p>
         </w:tc>
         <w:tc>
@@ -5096,8 +5231,13 @@
           </w:tcPr>
           <w:p>
             <w:r>
-              <w:t>Total number of inodes</w:t>
-            </w:r>
+              <w:t xml:space="preserve">Total number of </w:t>
+            </w:r>
+            <w:proofErr w:type="spellStart"/>
+            <w:r>
+              <w:t>inodes</w:t>
+            </w:r>
+            <w:proofErr w:type="spellEnd"/>
           </w:p>
         </w:tc>
       </w:tr>
@@ -5138,8 +5278,13 @@
           </w:tcPr>
           <w:p>
             <w:r>
-              <w:t>Number of free inodes</w:t>
-            </w:r>
+              <w:t xml:space="preserve">Number of free </w:t>
+            </w:r>
+            <w:proofErr w:type="spellStart"/>
+            <w:r>
+              <w:t>inodes</w:t>
+            </w:r>
+            <w:proofErr w:type="spellEnd"/>
           </w:p>
         </w:tc>
       </w:tr>
@@ -5478,8 +5623,13 @@
           </w:tcPr>
           <w:p>
             <w:r>
-              <w:t>Dir Inode</w:t>
-            </w:r>
+              <w:t xml:space="preserve">Dir </w:t>
+            </w:r>
+            <w:proofErr w:type="spellStart"/>
+            <w:r>
+              <w:t>Inode</w:t>
+            </w:r>
+            <w:proofErr w:type="spellEnd"/>
           </w:p>
         </w:tc>
         <w:tc>
@@ -5507,8 +5657,13 @@
             <w:tcW w:w="6155" w:type="dxa"/>
           </w:tcPr>
           <w:p>
-            <w:r>
-              <w:t>Inode of the directory within which to create the file</w:t>
+            <w:proofErr w:type="spellStart"/>
+            <w:r>
+              <w:t>Inode</w:t>
+            </w:r>
+            <w:proofErr w:type="spellEnd"/>
+            <w:r>
+              <w:t xml:space="preserve"> of the directory within which to create the file</w:t>
             </w:r>
           </w:p>
         </w:tc>
@@ -5600,61 +5755,70 @@
             <w:r>
               <w:t xml:space="preserve"> as passed by </w:t>
             </w:r>
+            <w:proofErr w:type="gramStart"/>
             <w:r>
               <w:rPr>
                 <w:i/>
                 <w:iCs/>
               </w:rPr>
-              <w:t>open(2)</w:t>
-            </w:r>
-            <w:r>
-              <w:t xml:space="preserve"> </w:t>
-            </w:r>
-            <w:r>
-              <w:t xml:space="preserve">(e.g. </w:t>
-            </w:r>
+              <w:t>open(</w:t>
+            </w:r>
+            <w:proofErr w:type="gramEnd"/>
             <w:r>
               <w:rPr>
                 <w:i/>
                 <w:iCs/>
               </w:rPr>
-              <w:t>O_RDWR</w:t>
-            </w:r>
-            <w:r>
-              <w:t xml:space="preserve">, </w:t>
+              <w:t>2)</w:t>
+            </w:r>
+            <w:r>
+              <w:t xml:space="preserve"> </w:t>
+            </w:r>
+            <w:r>
+              <w:t xml:space="preserve">(e.g. </w:t>
             </w:r>
             <w:r>
               <w:rPr>
                 <w:i/>
                 <w:iCs/>
               </w:rPr>
-              <w:t>O</w:t>
+              <w:t>O_RDWR</w:t>
+            </w:r>
+            <w:r>
+              <w:t xml:space="preserve">, </w:t>
             </w:r>
             <w:r>
               <w:rPr>
                 <w:i/>
                 <w:iCs/>
               </w:rPr>
-              <w:t>_</w:t>
+              <w:t>O</w:t>
             </w:r>
             <w:r>
               <w:rPr>
                 <w:i/>
                 <w:iCs/>
               </w:rPr>
-              <w:t>TRUNC</w:t>
-            </w:r>
-            <w:r>
-              <w:t>)</w:t>
-            </w:r>
-            <w:r>
-              <w:t xml:space="preserve">. Ignored if </w:t>
+              <w:t>_</w:t>
             </w:r>
             <w:r>
               <w:rPr>
                 <w:i/>
                 <w:iCs/>
               </w:rPr>
+              <w:t>TRUNC</w:t>
+            </w:r>
+            <w:r>
+              <w:t>)</w:t>
+            </w:r>
+            <w:r>
+              <w:t xml:space="preserve">. Ignored if </w:t>
+            </w:r>
+            <w:r>
+              <w:rPr>
+                <w:i/>
+                <w:iCs/>
+              </w:rPr>
               <w:t>Directory</w:t>
             </w:r>
             <w:r>
@@ -5713,7 +5877,15 @@
               <w:t>if</w:t>
             </w:r>
             <w:r>
-              <w:t xml:space="preserve"> the inode to be created is a directory, </w:t>
+              <w:t xml:space="preserve"> the </w:t>
+            </w:r>
+            <w:proofErr w:type="spellStart"/>
+            <w:r>
+              <w:t>inode</w:t>
+            </w:r>
+            <w:proofErr w:type="spellEnd"/>
+            <w:r>
+              <w:t xml:space="preserve"> to be created is a directory, </w:t>
             </w:r>
             <w:r>
               <w:rPr>
@@ -5917,8 +6089,13 @@
         <w:t>A request from</w:t>
       </w:r>
       <w:r>
-        <w:t xml:space="preserve"> the client to read data from the given inode</w:t>
-      </w:r>
+        <w:t xml:space="preserve"> the client to read data from the given </w:t>
+      </w:r>
+      <w:proofErr w:type="spellStart"/>
+      <w:r>
+        <w:t>inode</w:t>
+      </w:r>
+      <w:proofErr w:type="spellEnd"/>
     </w:p>
     <w:tbl>
       <w:tblPr>
@@ -6127,9 +6304,11 @@
             <w:tcW w:w="1589" w:type="dxa"/>
           </w:tcPr>
           <w:p>
+            <w:proofErr w:type="spellStart"/>
             <w:r>
               <w:t>Inode</w:t>
             </w:r>
+            <w:proofErr w:type="spellEnd"/>
           </w:p>
         </w:tc>
         <w:tc>
@@ -6157,8 +6336,13 @@
             <w:tcW w:w="6155" w:type="dxa"/>
           </w:tcPr>
           <w:p>
-            <w:r>
-              <w:t>Inode of the file from which to read</w:t>
+            <w:proofErr w:type="spellStart"/>
+            <w:r>
+              <w:t>Inode</w:t>
+            </w:r>
+            <w:proofErr w:type="spellEnd"/>
+            <w:r>
+              <w:t xml:space="preserve"> of the file from which to read</w:t>
             </w:r>
           </w:p>
         </w:tc>
@@ -7054,8 +7238,13 @@
             <w:tcW w:w="1589" w:type="dxa"/>
           </w:tcPr>
           <w:p>
-            <w:r>
-              <w:t>Inode Number</w:t>
+            <w:proofErr w:type="spellStart"/>
+            <w:r>
+              <w:t>Inode</w:t>
+            </w:r>
+            <w:proofErr w:type="spellEnd"/>
+            <w:r>
+              <w:t xml:space="preserve"> Number</w:t>
             </w:r>
           </w:p>
         </w:tc>
@@ -7085,7 +7274,15 @@
           </w:tcPr>
           <w:p>
             <w:r>
-              <w:t>The inode number of the directory entry.</w:t>
+              <w:t xml:space="preserve">The </w:t>
+            </w:r>
+            <w:proofErr w:type="spellStart"/>
+            <w:r>
+              <w:t>inode</w:t>
+            </w:r>
+            <w:proofErr w:type="spellEnd"/>
+            <w:r>
+              <w:t xml:space="preserve"> number of the directory entry.</w:t>
             </w:r>
           </w:p>
         </w:tc>
@@ -7317,7 +7514,15 @@
         <w:spacing w:line="240" w:lineRule="auto"/>
       </w:pPr>
       <w:r>
-        <w:t xml:space="preserve">A request from the client to write data to the given inode. </w:t>
+        <w:t xml:space="preserve">A request from the client to write data to the given </w:t>
+      </w:r>
+      <w:proofErr w:type="spellStart"/>
+      <w:r>
+        <w:t>inode</w:t>
+      </w:r>
+      <w:proofErr w:type="spellEnd"/>
+      <w:r>
+        <w:t xml:space="preserve">. </w:t>
       </w:r>
       <w:r>
         <w:t xml:space="preserve">The server </w:t>
@@ -7367,24 +7572,6 @@
       </w:r>
       <w:r>
         <w:t xml:space="preserve"> and return an appropriate error.</w:t>
-      </w:r>
-    </w:p>
-    <w:p>
-      <w:pPr>
-        <w:spacing w:line="240" w:lineRule="auto"/>
-      </w:pPr>
-      <w:r>
-        <w:t xml:space="preserve">The client is expected to send multiple </w:t>
-      </w:r>
-      <w:r>
-        <w:rPr>
-          <w:i/>
-          <w:iCs/>
-        </w:rPr>
-        <w:t>WRITE_REQ</w:t>
-      </w:r>
-      <w:r>
-        <w:t>s to service writes that don’t fit within one.</w:t>
       </w:r>
     </w:p>
     <w:tbl>
@@ -7594,9 +7781,11 @@
             <w:tcW w:w="1589" w:type="dxa"/>
           </w:tcPr>
           <w:p>
+            <w:proofErr w:type="spellStart"/>
             <w:r>
               <w:t>Inode</w:t>
             </w:r>
+            <w:proofErr w:type="spellEnd"/>
           </w:p>
         </w:tc>
         <w:tc>
@@ -7624,8 +7813,13 @@
             <w:tcW w:w="6155" w:type="dxa"/>
           </w:tcPr>
           <w:p>
-            <w:r>
-              <w:t>Inode of the file to write to</w:t>
+            <w:proofErr w:type="spellStart"/>
+            <w:r>
+              <w:t>Inode</w:t>
+            </w:r>
+            <w:proofErr w:type="spellEnd"/>
+            <w:r>
+              <w:t xml:space="preserve"> of the file to write to</w:t>
             </w:r>
           </w:p>
         </w:tc>
@@ -7705,7 +7899,7 @@
           </w:tcPr>
           <w:p>
             <w:r>
-              <w:t>16</w:t>
+              <w:t>32</w:t>
             </w:r>
           </w:p>
         </w:tc>
@@ -7737,7 +7931,7 @@
           </w:tcPr>
           <w:p>
             <w:r>
-              <w:t>184</w:t>
+              <w:t>200</w:t>
             </w:r>
           </w:p>
         </w:tc>
@@ -8024,9 +8218,11 @@
             <w:tcW w:w="1589" w:type="dxa"/>
           </w:tcPr>
           <w:p>
+            <w:proofErr w:type="spellStart"/>
             <w:r>
               <w:t>Inode</w:t>
             </w:r>
+            <w:proofErr w:type="spellEnd"/>
           </w:p>
         </w:tc>
         <w:tc>
@@ -8055,7 +8251,15 @@
           </w:tcPr>
           <w:p>
             <w:r>
-              <w:t xml:space="preserve">The inode number of the </w:t>
+              <w:t xml:space="preserve">The </w:t>
+            </w:r>
+            <w:proofErr w:type="spellStart"/>
+            <w:r>
+              <w:t>inode</w:t>
+            </w:r>
+            <w:proofErr w:type="spellEnd"/>
+            <w:r>
+              <w:t xml:space="preserve"> number of the </w:t>
             </w:r>
             <w:r>
               <w:t>directory</w:t>
@@ -8077,27 +8281,70 @@
     </w:p>
     <w:p>
       <w:r>
-        <w:t xml:space="preserve">Used by the client to remove an inode, corresponding to the </w:t>
-      </w:r>
+        <w:t xml:space="preserve">Used by the client to remove an </w:t>
+      </w:r>
+      <w:proofErr w:type="spellStart"/>
+      <w:r>
+        <w:t>inode</w:t>
+      </w:r>
+      <w:proofErr w:type="spellEnd"/>
+      <w:r>
+        <w:t xml:space="preserve">, corresponding to the </w:t>
+      </w:r>
+      <w:proofErr w:type="gramStart"/>
       <w:r>
         <w:rPr>
           <w:i/>
           <w:iCs/>
         </w:rPr>
-        <w:t xml:space="preserve">unlink(2) </w:t>
-      </w:r>
-      <w:r>
-        <w:t xml:space="preserve">and </w:t>
-      </w:r>
+        <w:t>unlink(</w:t>
+      </w:r>
+      <w:proofErr w:type="gramEnd"/>
       <w:r>
         <w:rPr>
           <w:i/>
           <w:iCs/>
         </w:rPr>
-        <w:t>rmdir(2)</w:t>
-      </w:r>
-      <w:r>
-        <w:t xml:space="preserve"> syscalls. If invoked on a file, the server </w:t>
+        <w:t xml:space="preserve">2) </w:t>
+      </w:r>
+      <w:r>
+        <w:t xml:space="preserve">and </w:t>
+      </w:r>
+      <w:proofErr w:type="spellStart"/>
+      <w:proofErr w:type="gramStart"/>
+      <w:r>
+        <w:rPr>
+          <w:i/>
+          <w:iCs/>
+        </w:rPr>
+        <w:t>rmdir</w:t>
+      </w:r>
+      <w:proofErr w:type="spellEnd"/>
+      <w:r>
+        <w:rPr>
+          <w:i/>
+          <w:iCs/>
+        </w:rPr>
+        <w:t>(</w:t>
+      </w:r>
+      <w:proofErr w:type="gramEnd"/>
+      <w:r>
+        <w:rPr>
+          <w:i/>
+          <w:iCs/>
+        </w:rPr>
+        <w:t>2)</w:t>
+      </w:r>
+      <w:r>
+        <w:t xml:space="preserve"> </w:t>
+      </w:r>
+      <w:proofErr w:type="spellStart"/>
+      <w:r>
+        <w:t>syscalls</w:t>
+      </w:r>
+      <w:proofErr w:type="spellEnd"/>
+      <w:r>
+        <w:t xml:space="preserve">. If invoked on a file, the server </w:t>
       </w:r>
       <w:r>
         <w:rPr>
@@ -8117,11 +8364,7 @@
         <w:t>must</w:t>
       </w:r>
       <w:r>
-        <w:t xml:space="preserve"> </w:t>
-      </w:r>
-      <w:r>
-        <w:lastRenderedPageBreak/>
-        <w:t xml:space="preserve">remove it and all its contents recursively (as in </w:t>
+        <w:t xml:space="preserve"> remove it and all its contents recursively (as in </w:t>
       </w:r>
       <w:r>
         <w:rPr>
@@ -8186,6 +8429,7 @@
                 <w:b/>
                 <w:bCs/>
               </w:rPr>
+              <w:lastRenderedPageBreak/>
               <w:t>Field</w:t>
             </w:r>
           </w:p>
@@ -8371,9 +8615,11 @@
             <w:tcW w:w="1589" w:type="dxa"/>
           </w:tcPr>
           <w:p>
+            <w:proofErr w:type="spellStart"/>
             <w:r>
               <w:t>Inode</w:t>
             </w:r>
+            <w:proofErr w:type="spellEnd"/>
           </w:p>
         </w:tc>
         <w:tc>
@@ -8402,10 +8648,23 @@
           </w:tcPr>
           <w:p>
             <w:r>
-              <w:t xml:space="preserve">The inode number of the </w:t>
-            </w:r>
-            <w:r>
-              <w:t>inode to remove</w:t>
+              <w:t xml:space="preserve">The </w:t>
+            </w:r>
+            <w:proofErr w:type="spellStart"/>
+            <w:r>
+              <w:t>inode</w:t>
+            </w:r>
+            <w:proofErr w:type="spellEnd"/>
+            <w:r>
+              <w:t xml:space="preserve"> number of the </w:t>
+            </w:r>
+            <w:proofErr w:type="spellStart"/>
+            <w:r>
+              <w:t>inode</w:t>
+            </w:r>
+            <w:proofErr w:type="spellEnd"/>
+            <w:r>
+              <w:t xml:space="preserve"> to remove</w:t>
             </w:r>
             <w:r>
               <w:t>.</w:t>
@@ -8427,7 +8686,15 @@
     </w:p>
     <w:p>
       <w:r>
-        <w:t xml:space="preserve">Used by the client to move or rename an inode. The server </w:t>
+        <w:t xml:space="preserve">Used by the client to move or rename an </w:t>
+      </w:r>
+      <w:proofErr w:type="spellStart"/>
+      <w:r>
+        <w:t>inode</w:t>
+      </w:r>
+      <w:proofErr w:type="spellEnd"/>
+      <w:r>
+        <w:t xml:space="preserve">. The server </w:t>
       </w:r>
       <w:r>
         <w:rPr>
@@ -8729,9 +8996,11 @@
             <w:tcW w:w="1589" w:type="dxa"/>
           </w:tcPr>
           <w:p>
+            <w:proofErr w:type="spellStart"/>
             <w:r>
               <w:t>Inode</w:t>
             </w:r>
+            <w:proofErr w:type="spellEnd"/>
           </w:p>
         </w:tc>
         <w:tc>
@@ -8760,7 +9029,23 @@
           </w:tcPr>
           <w:p>
             <w:r>
-              <w:t>The inode number of the inode to move.</w:t>
+              <w:t xml:space="preserve">The </w:t>
+            </w:r>
+            <w:proofErr w:type="spellStart"/>
+            <w:r>
+              <w:t>inode</w:t>
+            </w:r>
+            <w:proofErr w:type="spellEnd"/>
+            <w:r>
+              <w:t xml:space="preserve"> number of the </w:t>
+            </w:r>
+            <w:proofErr w:type="spellStart"/>
+            <w:r>
+              <w:t>inode</w:t>
+            </w:r>
+            <w:proofErr w:type="spellEnd"/>
+            <w:r>
+              <w:t xml:space="preserve"> to move.</w:t>
             </w:r>
           </w:p>
         </w:tc>
@@ -8802,7 +9087,23 @@
           </w:tcPr>
           <w:p>
             <w:r>
-              <w:t>The inode number of the directory to which the inode should be moved.</w:t>
+              <w:t xml:space="preserve">The </w:t>
+            </w:r>
+            <w:proofErr w:type="spellStart"/>
+            <w:r>
+              <w:t>inode</w:t>
+            </w:r>
+            <w:proofErr w:type="spellEnd"/>
+            <w:r>
+              <w:t xml:space="preserve"> number of the directory to which the </w:t>
+            </w:r>
+            <w:proofErr w:type="spellStart"/>
+            <w:r>
+              <w:t>inode</w:t>
+            </w:r>
+            <w:proofErr w:type="spellEnd"/>
+            <w:r>
+              <w:t xml:space="preserve"> should be moved.</w:t>
             </w:r>
           </w:p>
         </w:tc>
@@ -8889,7 +9190,15 @@
               <w:t>The filename</w:t>
             </w:r>
             <w:r>
-              <w:t xml:space="preserve"> within the destination directory to which the inode should be moved</w:t>
+              <w:t xml:space="preserve"> within the destination directory to which the </w:t>
+            </w:r>
+            <w:proofErr w:type="spellStart"/>
+            <w:r>
+              <w:t>inode</w:t>
+            </w:r>
+            <w:proofErr w:type="spellEnd"/>
+            <w:r>
+              <w:t xml:space="preserve"> should be moved</w:t>
             </w:r>
             <w:r>
               <w:t xml:space="preserve">. </w:t>
@@ -9112,8 +9421,13 @@
             <w:r>
               <w:t xml:space="preserve"> requested </w:t>
             </w:r>
-            <w:r>
-              <w:t xml:space="preserve">inode </w:t>
+            <w:proofErr w:type="spellStart"/>
+            <w:r>
+              <w:t>inode</w:t>
+            </w:r>
+            <w:proofErr w:type="spellEnd"/>
+            <w:r>
+              <w:t xml:space="preserve"> </w:t>
             </w:r>
             <w:r>
               <w:t>doesn’t exist</w:t>
@@ -9158,7 +9472,15 @@
               <w:t xml:space="preserve">. </w:t>
             </w:r>
             <w:r>
-              <w:t>An inode already exists at the requested destination path of a creation or renaming</w:t>
+              <w:t xml:space="preserve">An </w:t>
+            </w:r>
+            <w:proofErr w:type="spellStart"/>
+            <w:r>
+              <w:t>inode</w:t>
+            </w:r>
+            <w:proofErr w:type="spellEnd"/>
+            <w:r>
+              <w:t xml:space="preserve"> already exists at the requested destination path of a creation or renaming</w:t>
             </w:r>
             <w:r>
               <w:t xml:space="preserve"> operation</w:t>
@@ -9277,7 +9599,15 @@
         <w:footnoteRef/>
       </w:r>
       <w:r>
-        <w:t xml:space="preserve"> The number of seconds since 1 January, 1970 (the Unix epoch).</w:t>
+        <w:t xml:space="preserve"> The number of seconds since 1 </w:t>
+      </w:r>
+      <w:proofErr w:type="gramStart"/>
+      <w:r>
+        <w:t>January,</w:t>
+      </w:r>
+      <w:proofErr w:type="gramEnd"/>
+      <w:r>
+        <w:t xml:space="preserve"> 1970 (the Unix epoch).</w:t>
       </w:r>
     </w:p>
   </w:footnote>

</xml_diff>

<commit_message>
feat: Remove EOF READ_RES flag -- its implicit
</commit_message>
<xml_diff>
--- a/Protocol.docx
+++ b/Protocol.docx
@@ -6833,95 +6833,33 @@
           </w:tcPr>
           <w:p>
             <w:r>
-              <w:t>EOF</w:t>
-            </w:r>
-          </w:p>
-        </w:tc>
-        <w:tc>
-          <w:tcPr>
-            <w:tcW w:w="843" w:type="dxa"/>
+              <w:t>Chunk Length</w:t>
+            </w:r>
+          </w:p>
+        </w:tc>
+        <w:tc>
+          <w:tcPr>
+            <w:tcW w:w="843" w:type="dxa"/>
+          </w:tcPr>
+          <w:p>
+            <w:r>
+              <w:t>10</w:t>
+            </w:r>
+            <w:r>
+              <w:t>4</w:t>
+            </w:r>
+          </w:p>
+        </w:tc>
+        <w:tc>
+          <w:tcPr>
+            <w:tcW w:w="763" w:type="dxa"/>
           </w:tcPr>
           <w:p>
             <w:r>
               <w:t>1</w:t>
             </w:r>
             <w:r>
-              <w:t>04</w:t>
-            </w:r>
-          </w:p>
-        </w:tc>
-        <w:tc>
-          <w:tcPr>
-            <w:tcW w:w="763" w:type="dxa"/>
-          </w:tcPr>
-          <w:p>
-            <w:r>
-              <w:t>1</w:t>
-            </w:r>
-          </w:p>
-        </w:tc>
-        <w:tc>
-          <w:tcPr>
-            <w:tcW w:w="6155" w:type="dxa"/>
-          </w:tcPr>
-          <w:p>
-            <w:r>
-              <w:rPr>
-                <w:b/>
-                <w:bCs/>
-              </w:rPr>
-              <w:t>1</w:t>
-            </w:r>
-            <w:r>
-              <w:t xml:space="preserve"> if this chunk represents the EOF of this file. </w:t>
-            </w:r>
-            <w:r>
-              <w:rPr>
-                <w:b/>
-                <w:bCs/>
-              </w:rPr>
-              <w:t>0</w:t>
-            </w:r>
-            <w:r>
-              <w:t xml:space="preserve"> otherwise.</w:t>
-            </w:r>
-          </w:p>
-        </w:tc>
-      </w:tr>
-      <w:tr>
-        <w:tc>
-          <w:tcPr>
-            <w:tcW w:w="1589" w:type="dxa"/>
-          </w:tcPr>
-          <w:p>
-            <w:r>
-              <w:t>Chunk Length</w:t>
-            </w:r>
-          </w:p>
-        </w:tc>
-        <w:tc>
-          <w:tcPr>
-            <w:tcW w:w="843" w:type="dxa"/>
-          </w:tcPr>
-          <w:p>
-            <w:r>
-              <w:t>10</w:t>
-            </w:r>
-            <w:r>
-              <w:t>5</w:t>
-            </w:r>
-          </w:p>
-        </w:tc>
-        <w:tc>
-          <w:tcPr>
-            <w:tcW w:w="763" w:type="dxa"/>
-          </w:tcPr>
-          <w:p>
-            <w:r>
-              <w:t>1</w:t>
-            </w:r>
-            <w:r>
-              <w:t>5</w:t>
+              <w:t>6</w:t>
             </w:r>
           </w:p>
         </w:tc>
@@ -7103,27 +7041,7 @@
         <w:t>, the payload data is a series of packed directory entries of the following format</w:t>
       </w:r>
       <w:r>
-        <w:t xml:space="preserve">. The </w:t>
-      </w:r>
-      <w:r>
-        <w:rPr>
-          <w:i/>
-          <w:iCs/>
-        </w:rPr>
-        <w:t>EOF</w:t>
-      </w:r>
-      <w:r>
-        <w:t xml:space="preserve"> field of such </w:t>
-      </w:r>
-      <w:r>
-        <w:rPr>
-          <w:i/>
-          <w:iCs/>
-        </w:rPr>
-        <w:t>READ_RES</w:t>
-      </w:r>
-      <w:r>
-        <w:t xml:space="preserve"> messages is ignored.</w:t>
+        <w:t>.</w:t>
       </w:r>
     </w:p>
     <w:tbl>

</xml_diff>